<commit_message>
feat(mlflow): implementar experimento unificado mibici-equipo30 con runs para P1, P2 y P3 y capturas de evidencia
</commit_message>
<xml_diff>
--- a/MLOps_Equipo30/docs/TC5061_Propuesta_Proyecto_Equipo30.docx
+++ b/MLOps_Equipo30/docs/TC5061_Propuesta_Proyecto_Equipo30.docx
@@ -1677,7 +1677,7 @@
           <w:color w:val="0F172A"/>
           <w:sz w:val="28"/>
         </w:rPr>
-        <w:t>6. Experimento Base en MLflow</w:t>
+        <w:t>6. Experimento Base en MLflow (mibici-equipo30)</w:t>
       </w:r>
     </w:p>
     <w:p>
@@ -1691,7 +1691,7 @@
           <w:color w:val="334155"/>
           <w:sz w:val="20"/>
         </w:rPr>
-        <w:t>El experimento oficial se encuentra registrado en el servidor de MLflow bajo el nombre MiBici-Pregunta2-Riesgo-Estaciones (ID: 1). Se registraron dos corridas descriptivas con linaje completo hacia el commit de Git y la versión criptográfica de los datos:</w:t>
+        <w:t>En cumplimiento estricto de la rúbrica y las directrices de entrega de MLOps (TC5061), el equipo implementó y registró sus baselines y modelos candidatos en un único experimento unificado nombrado con el número de equipo: mibici-equipo30 (ID: 2). Este experimento centraliza las ejecuciones de las tres preguntas del proyecto (P1, P2 y P3), garantizando nombres descriptivos, parámetros de reproducibilidad (rango de fechas 2025-2026, versión de datos SHA-256, semillas), métricas prefijadas por partición (test_ / train_), etiquetas de gobernanza (equipo: 'Equipo 30', pregunta: 'P1'/'P2'/'P3', commit de Git) y artefactos diagnósticos registrados.</w:t>
       </w:r>
     </w:p>
     <w:tbl>
@@ -1719,9 +1719,9 @@
               <w:rPr>
                 <w:b/>
                 <w:color w:val="FFFFFF"/>
-                <w:sz w:val="17"/>
+                <w:sz w:val="16"/>
               </w:rPr>
-              <w:t>Run Name / Modelo</w:t>
+              <w:t>Pregunta</w:t>
             </w:r>
           </w:p>
         </w:tc>
@@ -1735,9 +1735,9 @@
               <w:rPr>
                 <w:b/>
                 <w:color w:val="FFFFFF"/>
-                <w:sz w:val="17"/>
+                <w:sz w:val="16"/>
               </w:rPr>
-              <w:t>Macro F1</w:t>
+              <w:t>Nombre Descriptivo del Run</w:t>
             </w:r>
           </w:p>
         </w:tc>
@@ -1751,9 +1751,9 @@
               <w:rPr>
                 <w:b/>
                 <w:color w:val="FFFFFF"/>
-                <w:sz w:val="17"/>
+                <w:sz w:val="16"/>
               </w:rPr>
-              <w:t>Balanced Acc</w:t>
+              <w:t>Modelo / Algoritmo</w:t>
             </w:r>
           </w:p>
         </w:tc>
@@ -1767,9 +1767,9 @@
               <w:rPr>
                 <w:b/>
                 <w:color w:val="FFFFFF"/>
-                <w:sz w:val="17"/>
+                <w:sz w:val="16"/>
               </w:rPr>
-              <w:t>Recall Desabasto</w:t>
+              <w:t>Métricas Principales (Test)</w:t>
             </w:r>
           </w:p>
         </w:tc>
@@ -1783,9 +1783,9 @@
               <w:rPr>
                 <w:b/>
                 <w:color w:val="FFFFFF"/>
-                <w:sz w:val="17"/>
+                <w:sz w:val="16"/>
               </w:rPr>
-              <w:t>Recall Saturación</w:t>
+              <w:t>Artefactos Registrados</w:t>
             </w:r>
           </w:p>
         </w:tc>
@@ -1799,9 +1799,9 @@
               <w:rPr>
                 <w:b/>
                 <w:color w:val="FFFFFF"/>
-                <w:sz w:val="17"/>
+                <w:sz w:val="16"/>
               </w:rPr>
-              <w:t>Tiempo de Ajuste</w:t>
+              <w:t>Tags Clave</w:t>
             </w:r>
           </w:p>
         </w:tc>
@@ -1812,20 +1812,18 @@
             <w:tcW w:type="dxa" w:w="1560"/>
             <w:shd w:fill="F8FAFC"/>
             <w:tcMar>
-              <w:top w:w="40" w:type="dxa"/>
-              <w:bottom w:w="40" w:type="dxa"/>
-              <w:left w:w="60" w:type="dxa"/>
-              <w:right w:w="60" w:type="dxa"/>
+              <w:top w:w="35" w:type="dxa"/>
+              <w:bottom w:w="35" w:type="dxa"/>
+              <w:left w:w="50" w:type="dxa"/>
+              <w:right w:w="50" w:type="dxa"/>
             </w:tcMar>
           </w:tcPr>
           <w:p>
             <w:r>
               <w:rPr>
-                <w:sz w:val="17"/>
+                <w:sz w:val="16"/>
               </w:rPr>
-              <w:t>p2_baseline_dummy_stratified</w:t>
-              <w:br/>
-              <w:t>(DummyClassifier)</w:t>
+              <w:t>P1</w:t>
             </w:r>
           </w:p>
         </w:tc>
@@ -1834,18 +1832,18 @@
             <w:tcW w:type="dxa" w:w="1560"/>
             <w:shd w:fill="F8FAFC"/>
             <w:tcMar>
-              <w:top w:w="40" w:type="dxa"/>
-              <w:bottom w:w="40" w:type="dxa"/>
-              <w:left w:w="60" w:type="dxa"/>
-              <w:right w:w="60" w:type="dxa"/>
+              <w:top w:w="35" w:type="dxa"/>
+              <w:bottom w:w="35" w:type="dxa"/>
+              <w:left w:w="50" w:type="dxa"/>
+              <w:right w:w="50" w:type="dxa"/>
             </w:tcMar>
           </w:tcPr>
           <w:p>
             <w:r>
               <w:rPr>
-                <w:sz w:val="17"/>
+                <w:sz w:val="16"/>
               </w:rPr>
-              <w:t>0.3330</w:t>
+              <w:t>p1_baseline_demanda_historica_horaria</w:t>
             </w:r>
           </w:p>
         </w:tc>
@@ -1854,18 +1852,20 @@
             <w:tcW w:type="dxa" w:w="1560"/>
             <w:shd w:fill="F8FAFC"/>
             <w:tcMar>
-              <w:top w:w="40" w:type="dxa"/>
-              <w:bottom w:w="40" w:type="dxa"/>
-              <w:left w:w="60" w:type="dxa"/>
-              <w:right w:w="60" w:type="dxa"/>
+              <w:top w:w="35" w:type="dxa"/>
+              <w:bottom w:w="35" w:type="dxa"/>
+              <w:left w:w="50" w:type="dxa"/>
+              <w:right w:w="50" w:type="dxa"/>
             </w:tcMar>
           </w:tcPr>
           <w:p>
             <w:r>
               <w:rPr>
-                <w:sz w:val="17"/>
+                <w:sz w:val="16"/>
               </w:rPr>
-              <w:t>33.32%</w:t>
+              <w:t>Promedio Histórico Horario</w:t>
+              <w:br/>
+              <w:t>(Estación, Día, Hora)</w:t>
             </w:r>
           </w:p>
         </w:tc>
@@ -1874,18 +1874,22 @@
             <w:tcW w:type="dxa" w:w="1560"/>
             <w:shd w:fill="F8FAFC"/>
             <w:tcMar>
-              <w:top w:w="40" w:type="dxa"/>
-              <w:bottom w:w="40" w:type="dxa"/>
-              <w:left w:w="60" w:type="dxa"/>
-              <w:right w:w="60" w:type="dxa"/>
+              <w:top w:w="35" w:type="dxa"/>
+              <w:bottom w:w="35" w:type="dxa"/>
+              <w:left w:w="50" w:type="dxa"/>
+              <w:right w:w="50" w:type="dxa"/>
             </w:tcMar>
           </w:tcPr>
           <w:p>
             <w:r>
               <w:rPr>
-                <w:sz w:val="17"/>
+                <w:sz w:val="16"/>
               </w:rPr>
-              <w:t>0.75%</w:t>
+              <w:t>test_mae: 1.2912</w:t>
+              <w:br/>
+              <w:t>test_rmse: 2.0143</w:t>
+              <w:br/>
+              <w:t>test_r2: 0.5382</w:t>
             </w:r>
           </w:p>
         </w:tc>
@@ -1894,18 +1898,20 @@
             <w:tcW w:type="dxa" w:w="1560"/>
             <w:shd w:fill="F8FAFC"/>
             <w:tcMar>
-              <w:top w:w="40" w:type="dxa"/>
-              <w:bottom w:w="40" w:type="dxa"/>
-              <w:left w:w="60" w:type="dxa"/>
-              <w:right w:w="60" w:type="dxa"/>
+              <w:top w:w="35" w:type="dxa"/>
+              <w:bottom w:w="35" w:type="dxa"/>
+              <w:left w:w="50" w:type="dxa"/>
+              <w:right w:w="50" w:type="dxa"/>
             </w:tcMar>
           </w:tcPr>
           <w:p>
             <w:r>
               <w:rPr>
-                <w:sz w:val="17"/>
+                <w:sz w:val="16"/>
               </w:rPr>
-              <w:t>0.73%</w:t>
+              <w:t>p1_demanda_prediccion_vs_real.png</w:t>
+              <w:br/>
+              <w:t>p1_baseline_metrics.txt</w:t>
             </w:r>
           </w:p>
         </w:tc>
@@ -1914,18 +1920,154 @@
             <w:tcW w:type="dxa" w:w="1560"/>
             <w:shd w:fill="F8FAFC"/>
             <w:tcMar>
-              <w:top w:w="40" w:type="dxa"/>
-              <w:bottom w:w="40" w:type="dxa"/>
-              <w:left w:w="60" w:type="dxa"/>
-              <w:right w:w="60" w:type="dxa"/>
+              <w:top w:w="35" w:type="dxa"/>
+              <w:bottom w:w="35" w:type="dxa"/>
+              <w:left w:w="50" w:type="dxa"/>
+              <w:right w:w="50" w:type="dxa"/>
             </w:tcMar>
           </w:tcPr>
           <w:p>
             <w:r>
               <w:rPr>
-                <w:sz w:val="17"/>
+                <w:sz w:val="16"/>
               </w:rPr>
-              <w:t>0.2 s</w:t>
+              <w:t>equipo: Equipo 30</w:t>
+              <w:br/>
+              <w:t>pregunta: P1</w:t>
+              <w:br/>
+              <w:t>commit: 90b6590</w:t>
+            </w:r>
+          </w:p>
+        </w:tc>
+      </w:tr>
+      <w:tr>
+        <w:tc>
+          <w:tcPr>
+            <w:tcW w:type="dxa" w:w="1560"/>
+            <w:shd w:fill="FFFFFF"/>
+            <w:tcMar>
+              <w:top w:w="35" w:type="dxa"/>
+              <w:bottom w:w="35" w:type="dxa"/>
+              <w:left w:w="50" w:type="dxa"/>
+              <w:right w:w="50" w:type="dxa"/>
+            </w:tcMar>
+          </w:tcPr>
+          <w:p>
+            <w:r>
+              <w:rPr>
+                <w:sz w:val="16"/>
+              </w:rPr>
+              <w:t>P2 (Baseline)</w:t>
+            </w:r>
+          </w:p>
+        </w:tc>
+        <w:tc>
+          <w:tcPr>
+            <w:tcW w:type="dxa" w:w="1560"/>
+            <w:shd w:fill="FFFFFF"/>
+            <w:tcMar>
+              <w:top w:w="35" w:type="dxa"/>
+              <w:bottom w:w="35" w:type="dxa"/>
+              <w:left w:w="50" w:type="dxa"/>
+              <w:right w:w="50" w:type="dxa"/>
+            </w:tcMar>
+          </w:tcPr>
+          <w:p>
+            <w:r>
+              <w:rPr>
+                <w:sz w:val="16"/>
+              </w:rPr>
+              <w:t>p2_baseline_dummy_stratified</w:t>
+            </w:r>
+          </w:p>
+        </w:tc>
+        <w:tc>
+          <w:tcPr>
+            <w:tcW w:type="dxa" w:w="1560"/>
+            <w:shd w:fill="FFFFFF"/>
+            <w:tcMar>
+              <w:top w:w="35" w:type="dxa"/>
+              <w:bottom w:w="35" w:type="dxa"/>
+              <w:left w:w="50" w:type="dxa"/>
+              <w:right w:w="50" w:type="dxa"/>
+            </w:tcMar>
+          </w:tcPr>
+          <w:p>
+            <w:r>
+              <w:rPr>
+                <w:sz w:val="16"/>
+              </w:rPr>
+              <w:t>DummyClassifier</w:t>
+              <w:br/>
+              <w:t>(Estratificado)</w:t>
+            </w:r>
+          </w:p>
+        </w:tc>
+        <w:tc>
+          <w:tcPr>
+            <w:tcW w:type="dxa" w:w="1560"/>
+            <w:shd w:fill="FFFFFF"/>
+            <w:tcMar>
+              <w:top w:w="35" w:type="dxa"/>
+              <w:bottom w:w="35" w:type="dxa"/>
+              <w:left w:w="50" w:type="dxa"/>
+              <w:right w:w="50" w:type="dxa"/>
+            </w:tcMar>
+          </w:tcPr>
+          <w:p>
+            <w:r>
+              <w:rPr>
+                <w:sz w:val="16"/>
+              </w:rPr>
+              <w:t>test_macro_f1: 0.3330</w:t>
+              <w:br/>
+              <w:t>test_balanced_acc: 33.31%</w:t>
+              <w:br/>
+              <w:t>recall_desabasto: 0.39%</w:t>
+            </w:r>
+          </w:p>
+        </w:tc>
+        <w:tc>
+          <w:tcPr>
+            <w:tcW w:type="dxa" w:w="1560"/>
+            <w:shd w:fill="FFFFFF"/>
+            <w:tcMar>
+              <w:top w:w="35" w:type="dxa"/>
+              <w:bottom w:w="35" w:type="dxa"/>
+              <w:left w:w="50" w:type="dxa"/>
+              <w:right w:w="50" w:type="dxa"/>
+            </w:tcMar>
+          </w:tcPr>
+          <w:p>
+            <w:r>
+              <w:rPr>
+                <w:sz w:val="16"/>
+              </w:rPr>
+              <w:t>p2_baseline_summary.txt</w:t>
+            </w:r>
+          </w:p>
+        </w:tc>
+        <w:tc>
+          <w:tcPr>
+            <w:tcW w:type="dxa" w:w="1560"/>
+            <w:shd w:fill="FFFFFF"/>
+            <w:tcMar>
+              <w:top w:w="35" w:type="dxa"/>
+              <w:bottom w:w="35" w:type="dxa"/>
+              <w:left w:w="50" w:type="dxa"/>
+              <w:right w:w="50" w:type="dxa"/>
+            </w:tcMar>
+          </w:tcPr>
+          <w:p>
+            <w:r>
+              <w:rPr>
+                <w:sz w:val="16"/>
+              </w:rPr>
+              <w:t>equipo: Equipo 30</w:t>
+              <w:br/>
+              <w:t>pregunta: P2</w:t>
+              <w:br/>
+              <w:t>commit: 90b6590</w:t>
             </w:r>
           </w:p>
         </w:tc>
@@ -1936,20 +2078,20 @@
             <w:tcW w:type="dxa" w:w="1560"/>
             <w:shd w:fill="EFF6FF"/>
             <w:tcMar>
-              <w:top w:w="40" w:type="dxa"/>
-              <w:bottom w:w="40" w:type="dxa"/>
-              <w:left w:w="60" w:type="dxa"/>
-              <w:right w:w="60" w:type="dxa"/>
+              <w:top w:w="35" w:type="dxa"/>
+              <w:bottom w:w="35" w:type="dxa"/>
+              <w:left w:w="50" w:type="dxa"/>
+              <w:right w:w="50" w:type="dxa"/>
             </w:tcMar>
           </w:tcPr>
           <w:p>
             <w:r>
               <w:rPr>
-                <w:sz w:val="17"/>
+                <w:b/>
+                <w:color w:val="16A34A"/>
+                <w:sz w:val="16"/>
               </w:rPr>
-              <w:t>p2_lgbm_risk_classifier_2025_2026</w:t>
-              <w:br/>
-              <w:t>(LGBMClassifier Balanced)</w:t>
+              <w:t>P2 (Candidato)</w:t>
             </w:r>
           </w:p>
         </w:tc>
@@ -1958,20 +2100,18 @@
             <w:tcW w:type="dxa" w:w="1560"/>
             <w:shd w:fill="EFF6FF"/>
             <w:tcMar>
-              <w:top w:w="40" w:type="dxa"/>
-              <w:bottom w:w="40" w:type="dxa"/>
-              <w:left w:w="60" w:type="dxa"/>
-              <w:right w:w="60" w:type="dxa"/>
+              <w:top w:w="35" w:type="dxa"/>
+              <w:bottom w:w="35" w:type="dxa"/>
+              <w:left w:w="50" w:type="dxa"/>
+              <w:right w:w="50" w:type="dxa"/>
             </w:tcMar>
           </w:tcPr>
           <w:p>
             <w:r>
               <w:rPr>
-                <w:b/>
-                <w:color w:val="16A34A"/>
-                <w:sz w:val="17"/>
+                <w:sz w:val="16"/>
               </w:rPr>
-              <w:t>0.3667</w:t>
+              <w:t>p2_lgbm_risk_classifier_2025_2026</w:t>
             </w:r>
           </w:p>
         </w:tc>
@@ -1980,20 +2120,20 @@
             <w:tcW w:type="dxa" w:w="1560"/>
             <w:shd w:fill="EFF6FF"/>
             <w:tcMar>
-              <w:top w:w="40" w:type="dxa"/>
-              <w:bottom w:w="40" w:type="dxa"/>
-              <w:left w:w="60" w:type="dxa"/>
-              <w:right w:w="60" w:type="dxa"/>
+              <w:top w:w="35" w:type="dxa"/>
+              <w:bottom w:w="35" w:type="dxa"/>
+              <w:left w:w="50" w:type="dxa"/>
+              <w:right w:w="50" w:type="dxa"/>
             </w:tcMar>
           </w:tcPr>
           <w:p>
             <w:r>
               <w:rPr>
-                <w:b/>
-                <w:color w:val="16A34A"/>
-                <w:sz w:val="17"/>
+                <w:sz w:val="16"/>
               </w:rPr>
-              <w:t>87.51%</w:t>
+              <w:t>LGBMClassifier</w:t>
+              <w:br/>
+              <w:t>(class_weight='balanced')</w:t>
             </w:r>
           </w:p>
         </w:tc>
@@ -2002,10 +2142,10 @@
             <w:tcW w:type="dxa" w:w="1560"/>
             <w:shd w:fill="EFF6FF"/>
             <w:tcMar>
-              <w:top w:w="40" w:type="dxa"/>
-              <w:bottom w:w="40" w:type="dxa"/>
-              <w:left w:w="60" w:type="dxa"/>
-              <w:right w:w="60" w:type="dxa"/>
+              <w:top w:w="35" w:type="dxa"/>
+              <w:bottom w:w="35" w:type="dxa"/>
+              <w:left w:w="50" w:type="dxa"/>
+              <w:right w:w="50" w:type="dxa"/>
             </w:tcMar>
           </w:tcPr>
           <w:p>
@@ -2013,9 +2153,15 @@
               <w:rPr>
                 <w:b/>
                 <w:color w:val="16A34A"/>
-                <w:sz w:val="17"/>
+                <w:sz w:val="16"/>
               </w:rPr>
-              <w:t>87.80%</w:t>
+              <w:t>test_macro_f1: 0.3667</w:t>
+              <w:br/>
+              <w:t>test_balanced_acc: 87.51%</w:t>
+              <w:br/>
+              <w:t>recall_desabasto: 87.80%</w:t>
+              <w:br/>
+              <w:t>recall_saturacion: 90.73%</w:t>
             </w:r>
           </w:p>
         </w:tc>
@@ -2024,20 +2170,24 @@
             <w:tcW w:type="dxa" w:w="1560"/>
             <w:shd w:fill="EFF6FF"/>
             <w:tcMar>
-              <w:top w:w="40" w:type="dxa"/>
-              <w:bottom w:w="40" w:type="dxa"/>
-              <w:left w:w="60" w:type="dxa"/>
-              <w:right w:w="60" w:type="dxa"/>
+              <w:top w:w="35" w:type="dxa"/>
+              <w:bottom w:w="35" w:type="dxa"/>
+              <w:left w:w="50" w:type="dxa"/>
+              <w:right w:w="50" w:type="dxa"/>
             </w:tcMar>
           </w:tcPr>
           <w:p>
             <w:r>
               <w:rPr>
-                <w:b/>
-                <w:color w:val="16A34A"/>
-                <w:sz w:val="17"/>
+                <w:sz w:val="16"/>
               </w:rPr>
-              <w:t>90.73%</w:t>
+              <w:t>p2_confusion_matrix.png</w:t>
+              <w:br/>
+              <w:t>p2_feature_importance.png</w:t>
+              <w:br/>
+              <w:t>p2_classification_report.txt</w:t>
+              <w:br/>
+              <w:t>p2_lgbm_risk_classifier.joblib</w:t>
             </w:r>
           </w:p>
         </w:tc>
@@ -2046,23 +2196,208 @@
             <w:tcW w:type="dxa" w:w="1560"/>
             <w:shd w:fill="EFF6FF"/>
             <w:tcMar>
-              <w:top w:w="40" w:type="dxa"/>
-              <w:bottom w:w="40" w:type="dxa"/>
-              <w:left w:w="60" w:type="dxa"/>
-              <w:right w:w="60" w:type="dxa"/>
+              <w:top w:w="35" w:type="dxa"/>
+              <w:bottom w:w="35" w:type="dxa"/>
+              <w:left w:w="50" w:type="dxa"/>
+              <w:right w:w="50" w:type="dxa"/>
             </w:tcMar>
           </w:tcPr>
           <w:p>
             <w:r>
               <w:rPr>
-                <w:sz w:val="17"/>
+                <w:sz w:val="16"/>
               </w:rPr>
-              <w:t>11.9 s</w:t>
+              <w:t>equipo: Equipo 30</w:t>
+              <w:br/>
+              <w:t>pregunta: P2</w:t>
+              <w:br/>
+              <w:t>commit: 90b6590</w:t>
+              <w:br/>
+              <w:t>autor: Ricardo Bahamon</w:t>
+            </w:r>
+          </w:p>
+        </w:tc>
+      </w:tr>
+      <w:tr>
+        <w:tc>
+          <w:tcPr>
+            <w:tcW w:type="dxa" w:w="1560"/>
+            <w:shd w:fill="FFFFFF"/>
+            <w:tcMar>
+              <w:top w:w="35" w:type="dxa"/>
+              <w:bottom w:w="35" w:type="dxa"/>
+              <w:left w:w="50" w:type="dxa"/>
+              <w:right w:w="50" w:type="dxa"/>
+            </w:tcMar>
+          </w:tcPr>
+          <w:p>
+            <w:r>
+              <w:rPr>
+                <w:sz w:val="16"/>
+              </w:rPr>
+              <w:t>P3</w:t>
+            </w:r>
+          </w:p>
+        </w:tc>
+        <w:tc>
+          <w:tcPr>
+            <w:tcW w:type="dxa" w:w="1560"/>
+            <w:shd w:fill="FFFFFF"/>
+            <w:tcMar>
+              <w:top w:w="35" w:type="dxa"/>
+              <w:bottom w:w="35" w:type="dxa"/>
+              <w:left w:w="50" w:type="dxa"/>
+              <w:right w:w="50" w:type="dxa"/>
+            </w:tcMar>
+          </w:tcPr>
+          <w:p>
+            <w:r>
+              <w:rPr>
+                <w:sz w:val="16"/>
+              </w:rPr>
+              <w:t>p3_baseline_kmeans_clustering_estaciones</w:t>
+            </w:r>
+          </w:p>
+        </w:tc>
+        <w:tc>
+          <w:tcPr>
+            <w:tcW w:type="dxa" w:w="1560"/>
+            <w:shd w:fill="FFFFFF"/>
+            <w:tcMar>
+              <w:top w:w="35" w:type="dxa"/>
+              <w:bottom w:w="35" w:type="dxa"/>
+              <w:left w:w="50" w:type="dxa"/>
+              <w:right w:w="50" w:type="dxa"/>
+            </w:tcMar>
+          </w:tcPr>
+          <w:p>
+            <w:r>
+              <w:rPr>
+                <w:sz w:val="16"/>
+              </w:rPr>
+              <w:t>K-Means (k=4)</w:t>
+              <w:br/>
+              <w:t>(Perfil horario + capacidad)</w:t>
+            </w:r>
+          </w:p>
+        </w:tc>
+        <w:tc>
+          <w:tcPr>
+            <w:tcW w:type="dxa" w:w="1560"/>
+            <w:shd w:fill="FFFFFF"/>
+            <w:tcMar>
+              <w:top w:w="35" w:type="dxa"/>
+              <w:bottom w:w="35" w:type="dxa"/>
+              <w:left w:w="50" w:type="dxa"/>
+              <w:right w:w="50" w:type="dxa"/>
+            </w:tcMar>
+          </w:tcPr>
+          <w:p>
+            <w:r>
+              <w:rPr>
+                <w:sz w:val="16"/>
+              </w:rPr>
+              <w:t>test_silhouette: 0.2735</w:t>
+              <w:br/>
+              <w:t>test_davies_bouldin: 1.3819</w:t>
+              <w:br/>
+              <w:t>test_calinski_harabasz: 201.2</w:t>
+            </w:r>
+          </w:p>
+        </w:tc>
+        <w:tc>
+          <w:tcPr>
+            <w:tcW w:type="dxa" w:w="1560"/>
+            <w:shd w:fill="FFFFFF"/>
+            <w:tcMar>
+              <w:top w:w="35" w:type="dxa"/>
+              <w:bottom w:w="35" w:type="dxa"/>
+              <w:left w:w="50" w:type="dxa"/>
+              <w:right w:w="50" w:type="dxa"/>
+            </w:tcMar>
+          </w:tcPr>
+          <w:p>
+            <w:r>
+              <w:rPr>
+                <w:sz w:val="16"/>
+              </w:rPr>
+              <w:t>p3_clusters_estaciones_mapa.png</w:t>
+              <w:br/>
+              <w:t>p3_perfil_clusters.png</w:t>
+              <w:br/>
+              <w:t>p3_clustering_report.txt</w:t>
+            </w:r>
+          </w:p>
+        </w:tc>
+        <w:tc>
+          <w:tcPr>
+            <w:tcW w:type="dxa" w:w="1560"/>
+            <w:shd w:fill="FFFFFF"/>
+            <w:tcMar>
+              <w:top w:w="35" w:type="dxa"/>
+              <w:bottom w:w="35" w:type="dxa"/>
+              <w:left w:w="50" w:type="dxa"/>
+              <w:right w:w="50" w:type="dxa"/>
+            </w:tcMar>
+          </w:tcPr>
+          <w:p>
+            <w:r>
+              <w:rPr>
+                <w:sz w:val="16"/>
+              </w:rPr>
+              <w:t>equipo: Equipo 30</w:t>
+              <w:br/>
+              <w:t>pregunta: P3</w:t>
+              <w:br/>
+              <w:t>commit: 90b6590</w:t>
             </w:r>
           </w:p>
         </w:tc>
       </w:tr>
     </w:tbl>
+    <w:p>
+      <w:pPr>
+        <w:spacing w:before="0" w:after="100" w:line="276" w:lineRule="auto"/>
+      </w:pPr>
+      <w:r>
+        <w:rPr>
+          <w:rFonts w:ascii="Arial" w:hAnsi="Arial"/>
+          <w:i w:val="0"/>
+          <w:color w:val="334155"/>
+          <w:sz w:val="20"/>
+        </w:rPr>
+        <w:t>A continuación se presenta la evidencia visual capturada directamente desde la interfaz gráfica oficial de MLflow Tracking (disponible localmente en http://127.0.0.1:5005/#/experiments/2/runs?workflowType=machine_learning):</w:t>
+      </w:r>
+    </w:p>
+    <w:p>
+      <w:pPr>
+        <w:keepNext/>
+        <w:spacing w:before="240" w:after="80"/>
+      </w:pPr>
+      <w:r>
+        <w:rPr>
+          <w:rFonts w:ascii="Arial" w:hAnsi="Arial"/>
+          <w:b/>
+          <w:color w:val="0369A1"/>
+          <w:sz w:val="23"/>
+        </w:rPr>
+        <w:t>6.1 Evidencia 1: Lista de Runs del Experimento mibici-equipo30</w:t>
+      </w:r>
+    </w:p>
+    <w:p>
+      <w:pPr>
+        <w:spacing w:before="0" w:after="100" w:line="276" w:lineRule="auto"/>
+      </w:pPr>
+      <w:r>
+        <w:rPr>
+          <w:rFonts w:ascii="Arial" w:hAnsi="Arial"/>
+          <w:i w:val="0"/>
+          <w:color w:val="334155"/>
+          <w:sz w:val="20"/>
+        </w:rPr>
+        <w:t>La vista principal del experimento mibici-equipo30 evidencia el registro ordenado y descriptivo de los runs para P1, P2 (baseline y modelo candidato) y P3, con sus marcas temporales, estado 'Finished' y linaje directo al archivo ejecutable run_all_experiments.py:</w:t>
+      </w:r>
+    </w:p>
     <w:p>
       <w:pPr>
         <w:keepNext/>
@@ -2072,7 +2407,7 @@
       <w:r>
         <w:drawing>
           <wp:inline xmlns:a="http://schemas.openxmlformats.org/drawingml/2006/main" xmlns:pic="http://schemas.openxmlformats.org/drawingml/2006/picture">
-            <wp:extent cx="5669280" cy="3049186"/>
+            <wp:extent cx="5669280" cy="2992120"/>
             <wp:docPr id="2" name="Picture 2"/>
             <wp:cNvGraphicFramePr>
               <a:graphicFrameLocks noChangeAspect="1"/>
@@ -2081,7 +2416,7 @@
               <a:graphicData uri="http://schemas.openxmlformats.org/drawingml/2006/picture">
                 <pic:pic>
                   <pic:nvPicPr>
-                    <pic:cNvPr id="0" name="p2_mlflow_dashboard_capture.png"/>
+                    <pic:cNvPr id="0" name="p2_mlflow_runs_list.png"/>
                     <pic:cNvPicPr/>
                   </pic:nvPicPr>
                   <pic:blipFill>
@@ -2093,7 +2428,7 @@
                   <pic:spPr>
                     <a:xfrm>
                       <a:off x="0" y="0"/>
-                      <a:ext cx="5669280" cy="3049186"/>
+                      <a:ext cx="5669280" cy="2992120"/>
                     </a:xfrm>
                     <a:prstGeom prst="rect"/>
                   </pic:spPr>
@@ -2116,7 +2451,36 @@
           <w:color w:val="64748B"/>
           <w:sz w:val="17"/>
         </w:rPr>
-        <w:t>Figura: Captura de Pantalla del Dashboard de MLflow (Runs, Parámetros, Métricas y Artefactos)</w:t>
+        <w:t>Figura: Figura 6.1: Lista de Runs del Experimento 'mibici-equipo30' en MLflow Tracking</w:t>
+      </w:r>
+    </w:p>
+    <w:p>
+      <w:pPr>
+        <w:keepNext/>
+        <w:spacing w:before="240" w:after="80"/>
+      </w:pPr>
+      <w:r>
+        <w:rPr>
+          <w:rFonts w:ascii="Arial" w:hAnsi="Arial"/>
+          <w:b/>
+          <w:color w:val="0369A1"/>
+          <w:sz w:val="23"/>
+        </w:rPr>
+        <w:t>6.2 Evidencia 2: Detalle de Run (Parámetros, Métricas y Etiquetas)</w:t>
+      </w:r>
+    </w:p>
+    <w:p>
+      <w:pPr>
+        <w:spacing w:before="0" w:after="100" w:line="276" w:lineRule="auto"/>
+      </w:pPr>
+      <w:r>
+        <w:rPr>
+          <w:rFonts w:ascii="Arial" w:hAnsi="Arial"/>
+          <w:i w:val="0"/>
+          <w:color w:val="334155"/>
+          <w:sz w:val="20"/>
+        </w:rPr>
+        <w:t>La vista detallada del run p2_lgbm_risk_classifier_2025_2026 demuestra la captura íntegra de: 1) 20 parámetros reproducibles (class_weight='balanced', learning_rate=0.08, n_estimators=120, train_end_date='2026-01-01', versión criptográfica de datos); 2) 9 métricas rigurosamente prefijadas por conjunto (test_macro_f1=0.3667, test_balanced_accuracy=0.8751, recall por clase); 3) Etiquetas formales de gobernanza (equipo='Equipo 30', pregunta='P2', git_commit='90b6590...', autor='Ricardo Bahamon (Equipo 30)'):</w:t>
       </w:r>
     </w:p>
     <w:p>
@@ -2128,7 +2492,7 @@
       <w:r>
         <w:drawing>
           <wp:inline xmlns:a="http://schemas.openxmlformats.org/drawingml/2006/main" xmlns:pic="http://schemas.openxmlformats.org/drawingml/2006/picture">
-            <wp:extent cx="4389120" cy="3749835"/>
+            <wp:extent cx="5669280" cy="3366135"/>
             <wp:docPr id="3" name="Picture 3"/>
             <wp:cNvGraphicFramePr>
               <a:graphicFrameLocks noChangeAspect="1"/>
@@ -2137,7 +2501,7 @@
               <a:graphicData uri="http://schemas.openxmlformats.org/drawingml/2006/picture">
                 <pic:pic>
                   <pic:nvPicPr>
-                    <pic:cNvPr id="0" name="p2_confusion_matrix.png"/>
+                    <pic:cNvPr id="0" name="p2_mlflow_run_detail.png"/>
                     <pic:cNvPicPr/>
                   </pic:nvPicPr>
                   <pic:blipFill>
@@ -2149,7 +2513,7 @@
                   <pic:spPr>
                     <a:xfrm>
                       <a:off x="0" y="0"/>
-                      <a:ext cx="4389120" cy="3749835"/>
+                      <a:ext cx="5669280" cy="3366135"/>
                     </a:xfrm>
                     <a:prstGeom prst="rect"/>
                   </pic:spPr>
@@ -2172,7 +2536,36 @@
           <w:color w:val="64748B"/>
           <w:sz w:val="17"/>
         </w:rPr>
-        <w:t>Figura: Matriz de Confusión sobre el Conjunto de Test (Enero a Septiembre 2026)</w:t>
+        <w:t>Figura: Figura 6.2: Detalle del Run de LightGBM con Parámetros, Métricas Prefijadas y Etiquetas</w:t>
+      </w:r>
+    </w:p>
+    <w:p>
+      <w:pPr>
+        <w:keepNext/>
+        <w:spacing w:before="240" w:after="80"/>
+      </w:pPr>
+      <w:r>
+        <w:rPr>
+          <w:rFonts w:ascii="Arial" w:hAnsi="Arial"/>
+          <w:b/>
+          <w:color w:val="0369A1"/>
+          <w:sz w:val="23"/>
+        </w:rPr>
+        <w:t>6.3 Evidencia 3: Artefactos Registrados (Visualizaciones y Modelos)</w:t>
+      </w:r>
+    </w:p>
+    <w:p>
+      <w:pPr>
+        <w:spacing w:before="0" w:after="100" w:line="276" w:lineRule="auto"/>
+      </w:pPr>
+      <w:r>
+        <w:rPr>
+          <w:rFonts w:ascii="Arial" w:hAnsi="Arial"/>
+          <w:i w:val="0"/>
+          <w:color w:val="334155"/>
+          <w:sz w:val="20"/>
+        </w:rPr>
+        <w:t>Cada corrida exitosa registra sus artefactos en el repositorio de artefactos de MLflow. A continuación se observa la inspección interactiva de la Matriz de Confusión Normalizada sobre el conjunto de prueba (2026), junto a la estructura de carpetas figures/, models/ (p2_lgbm_risk_classifier.joblib) y reports/ (p2_classification_report.txt):</w:t>
       </w:r>
     </w:p>
     <w:p>
@@ -2184,7 +2577,7 @@
       <w:r>
         <w:drawing>
           <wp:inline xmlns:a="http://schemas.openxmlformats.org/drawingml/2006/main" xmlns:pic="http://schemas.openxmlformats.org/drawingml/2006/picture">
-            <wp:extent cx="4572000" cy="3414532"/>
+            <wp:extent cx="5669280" cy="3366135"/>
             <wp:docPr id="4" name="Picture 4"/>
             <wp:cNvGraphicFramePr>
               <a:graphicFrameLocks noChangeAspect="1"/>
@@ -2193,7 +2586,7 @@
               <a:graphicData uri="http://schemas.openxmlformats.org/drawingml/2006/picture">
                 <pic:pic>
                   <pic:nvPicPr>
-                    <pic:cNvPr id="0" name="p2_feature_importance.png"/>
+                    <pic:cNvPr id="0" name="p2_mlflow_artifact_detail.png"/>
                     <pic:cNvPicPr/>
                   </pic:nvPicPr>
                   <pic:blipFill>
@@ -2205,7 +2598,7 @@
                   <pic:spPr>
                     <a:xfrm>
                       <a:off x="0" y="0"/>
-                      <a:ext cx="4572000" cy="3414532"/>
+                      <a:ext cx="5669280" cy="3366135"/>
                     </a:xfrm>
                     <a:prstGeom prst="rect"/>
                   </pic:spPr>
@@ -2228,7 +2621,7 @@
           <w:color w:val="64748B"/>
           <w:sz w:val="17"/>
         </w:rPr>
-        <w:t>Figura: Importancia de Características (Feature Importance) del Modelo LightGBM</w:t>
+        <w:t>Figura: Figura 6.3: Artefacto Diagnóstico (Matriz de Confusión) Visualizado en MLflow</w:t>
       </w:r>
     </w:p>
     <w:p>
@@ -2243,7 +2636,7 @@
           <w:color w:val="0369A1"/>
           <w:sz w:val="23"/>
         </w:rPr>
-        <w:t>6.1 Instrucciones para Visualizar los Experimentos Localmente</w:t>
+        <w:t>6.4 Evidencia 4: Comparación de Dos o Más Runs</w:t>
       </w:r>
     </w:p>
     <w:p>
@@ -2257,7 +2650,92 @@
           <w:color w:val="334155"/>
           <w:sz w:val="20"/>
         </w:rPr>
-        <w:t>Para levantar la interfaz gráfica interactiva de MLflow en su máquina local y explorar todos los runs, parámetros y artefactos, ejecute el siguiente comando desde la terminal dentro del directorio MLOps_Equipo30/:</w:t>
+        <w:t>MLflow Tracking permite contrastar directamente corridas competitivas. La siguiente comparativa muestra el contraste multivariado y de coordenadas paralelas entre el Baseline Heurístico Estratificado (p2_baseline_dummy_stratified) y el Modelo Candidato LightGBM (p2_lgbm_risk_classifier_2025_2026), evidenciando el salto cualitativo en Macro F1 y Balanced Accuracy:</w:t>
+      </w:r>
+    </w:p>
+    <w:p>
+      <w:pPr>
+        <w:keepNext/>
+        <w:spacing w:before="200" w:after="80"/>
+        <w:jc w:val="center"/>
+      </w:pPr>
+      <w:r>
+        <w:drawing>
+          <wp:inline xmlns:a="http://schemas.openxmlformats.org/drawingml/2006/main" xmlns:pic="http://schemas.openxmlformats.org/drawingml/2006/picture">
+            <wp:extent cx="5669280" cy="3366135"/>
+            <wp:docPr id="5" name="Picture 5"/>
+            <wp:cNvGraphicFramePr>
+              <a:graphicFrameLocks noChangeAspect="1"/>
+            </wp:cNvGraphicFramePr>
+            <a:graphic>
+              <a:graphicData uri="http://schemas.openxmlformats.org/drawingml/2006/picture">
+                <pic:pic>
+                  <pic:nvPicPr>
+                    <pic:cNvPr id="0" name="p2_mlflow_runs_comparison.png"/>
+                    <pic:cNvPicPr/>
+                  </pic:nvPicPr>
+                  <pic:blipFill>
+                    <a:blip r:embed="rId13"/>
+                    <a:stretch>
+                      <a:fillRect/>
+                    </a:stretch>
+                  </pic:blipFill>
+                  <pic:spPr>
+                    <a:xfrm>
+                      <a:off x="0" y="0"/>
+                      <a:ext cx="5669280" cy="3366135"/>
+                    </a:xfrm>
+                    <a:prstGeom prst="rect"/>
+                  </pic:spPr>
+                </pic:pic>
+              </a:graphicData>
+            </a:graphic>
+          </wp:inline>
+        </w:drawing>
+      </w:r>
+    </w:p>
+    <w:p>
+      <w:pPr>
+        <w:spacing w:before="40" w:after="240"/>
+        <w:jc w:val="center"/>
+      </w:pPr>
+      <w:r>
+        <w:rPr>
+          <w:rFonts w:ascii="Arial" w:hAnsi="Arial"/>
+          <w:i/>
+          <w:color w:val="64748B"/>
+          <w:sz w:val="17"/>
+        </w:rPr>
+        <w:t>Figura: Figura 6.4: Comparación Directa de Runs (Baseline vs Modelo Candidato LightGBM)</w:t>
+      </w:r>
+    </w:p>
+    <w:p>
+      <w:pPr>
+        <w:keepNext/>
+        <w:spacing w:before="240" w:after="80"/>
+      </w:pPr>
+      <w:r>
+        <w:rPr>
+          <w:rFonts w:ascii="Arial" w:hAnsi="Arial"/>
+          <w:b/>
+          <w:color w:val="0369A1"/>
+          <w:sz w:val="23"/>
+        </w:rPr>
+        <w:t>6.5 Instrucciones para Visualizar los Experimentos Localmente</w:t>
+      </w:r>
+    </w:p>
+    <w:p>
+      <w:pPr>
+        <w:spacing w:before="0" w:after="100" w:line="276" w:lineRule="auto"/>
+      </w:pPr>
+      <w:r>
+        <w:rPr>
+          <w:rFonts w:ascii="Arial" w:hAnsi="Arial"/>
+          <w:i w:val="0"/>
+          <w:color w:val="334155"/>
+          <w:sz w:val="20"/>
+        </w:rPr>
+        <w:t>Para levantar la interfaz gráfica interactiva de MLflow en su entorno local y navegar los experimentos, parámetros y artefactos, ejecute los siguientes pasos desde la terminal dentro de MLOps_Equipo30/:</w:t>
       </w:r>
     </w:p>
     <w:p>
@@ -2271,7 +2749,7 @@
           <w:color w:val="0F172A"/>
           <w:sz w:val="20"/>
         </w:rPr>
-        <w:t xml:space="preserve">Comando de Terminal: </w:t>
+        <w:t xml:space="preserve">1. Para ejecutar todos los experimentos (P1, P2 y P3): </w:t>
       </w:r>
       <w:r>
         <w:rPr>
@@ -2280,7 +2758,30 @@
           <w:color w:val="334155"/>
           <w:sz w:val="20"/>
         </w:rPr>
-        <w:t>mlflow ui --backend-store-uri sqlite:///mlflow.db --port 5000</w:t>
+        <w:t>python -m MiBici.modeling.run_all_experiments</w:t>
+      </w:r>
+    </w:p>
+    <w:p>
+      <w:pPr>
+        <w:spacing w:before="0" w:after="100" w:line="276" w:lineRule="auto"/>
+      </w:pPr>
+      <w:r>
+        <w:rPr>
+          <w:rFonts w:ascii="Arial" w:hAnsi="Arial"/>
+          <w:b/>
+          <w:color w:val="0F172A"/>
+          <w:sz w:val="20"/>
+        </w:rPr>
+        <w:t xml:space="preserve">2. Para iniciar el servidor MLflow: </w:t>
+      </w:r>
+      <w:r>
+        <w:rPr>
+          <w:rFonts w:ascii="Arial" w:hAnsi="Arial"/>
+          <w:i/>
+          <w:color w:val="334155"/>
+          <w:sz w:val="20"/>
+        </w:rPr>
+        <w:t>mlflow ui --backend-store-uri sqlite:///mlflow.db --port 5005</w:t>
       </w:r>
     </w:p>
     <w:p>
@@ -2294,7 +2795,9 @@
           <w:color w:val="334155"/>
           <w:sz w:val="20"/>
         </w:rPr>
-        <w:t>Posteriormente, abra en cualquier navegador web la dirección: http://127.0.0.1:5000</w:t>
+        <w:t>3. Abra en cualquier navegador web la URL: http://127.0.0.1:5005/#/experiments/2/runs?workflowType=machine_learning</w:t>
+        <w:br/>
+        <w:t>(Nota: en macOS el puerto 5000 suele estar reservado por Apple AirPlay Receiver/ControlCenter, por lo que se utiliza el puerto 5005. Asimismo, en MLflow 3.16+ la pestaña 'Model training' muestra la vista tabular de corridas de Machine Learning, evitando la vista inicial vacía de 'GenAI/Traces').</w:t>
       </w:r>
     </w:p>
     <w:p>
@@ -2336,7 +2839,7 @@
         <w:drawing>
           <wp:inline xmlns:a="http://schemas.openxmlformats.org/drawingml/2006/main" xmlns:pic="http://schemas.openxmlformats.org/drawingml/2006/picture">
             <wp:extent cx="5669280" cy="3103185"/>
-            <wp:docPr id="5" name="Picture 5"/>
+            <wp:docPr id="6" name="Picture 6"/>
             <wp:cNvGraphicFramePr>
               <a:graphicFrameLocks noChangeAspect="1"/>
             </wp:cNvGraphicFramePr>
@@ -2348,7 +2851,7 @@
                     <pic:cNvPicPr/>
                   </pic:nvPicPr>
                   <pic:blipFill>
-                    <a:blip r:embed="rId13"/>
+                    <a:blip r:embed="rId14"/>
                     <a:stretch>
                       <a:fillRect/>
                     </a:stretch>

</xml_diff>